<commit_message>
docs: atualiza arquivos de curriculo CV_Minoru_Yamanaka (PDF e DOCX)
</commit_message>
<xml_diff>
--- a/CV_Minoru_Yamanaka.docx
+++ b/CV_Minoru_Yamanaka.docx
@@ -3655,6 +3655,26 @@
           <w:szCs w:val="18"/>
         </w:rPr>
       </w:pPr>
+      <w:r>
+        <w:rPr>
+          <w:b/>
+          <w:bCs/>
+          <w:sz w:val="18"/>
+          <w:szCs w:val="18"/>
+          <w:lang w:val="pt-BR"/>
+        </w:rPr>
+        <w:t>•</w:t>
+      </w:r>
+      <w:r>
+        <w:rPr>
+          <w:b/>
+          <w:bCs/>
+          <w:sz w:val="18"/>
+          <w:szCs w:val="18"/>
+          <w:lang w:val="pt-BR"/>
+        </w:rPr>
+        <w:t xml:space="preserve"> </w:t>
+      </w:r>
       <w:r>
         <w:rPr>
           <w:b/>
@@ -3869,87 +3889,7 @@
           <w:sz w:val="18"/>
           <w:szCs w:val="18"/>
         </w:rPr>
-        <w:t xml:space="preserve">Desenvolvimento de Aplicações com IA Generativa </w:t>
-      </w:r>
-      <w:r>
-        <w:rPr>
-          <w:color w:val="000000" w:themeColor="text1"/>
-          <w:sz w:val="18"/>
-          <w:szCs w:val="18"/>
-        </w:rPr>
-        <w:t>e</w:t>
-      </w:r>
-      <w:r>
-        <w:rPr>
-          <w:color w:val="000000" w:themeColor="text1"/>
-          <w:sz w:val="18"/>
-          <w:szCs w:val="18"/>
-        </w:rPr>
-        <w:t xml:space="preserve"> Google Antigravity (SENAI Ary Torres) </w:t>
-      </w:r>
-      <w:r>
-        <w:rPr>
-          <w:color w:val="000000" w:themeColor="text1"/>
-          <w:sz w:val="18"/>
-          <w:szCs w:val="18"/>
-        </w:rPr>
-        <w:t>-</w:t>
-      </w:r>
-      <w:r>
-        <w:rPr>
-          <w:color w:val="000000" w:themeColor="text1"/>
-          <w:sz w:val="18"/>
-          <w:szCs w:val="18"/>
-        </w:rPr>
-        <w:t xml:space="preserve"> 40 h</w:t>
-      </w:r>
-      <w:r>
-        <w:rPr>
-          <w:color w:val="000000" w:themeColor="text1"/>
-          <w:sz w:val="18"/>
-          <w:szCs w:val="18"/>
-        </w:rPr>
-        <w:t xml:space="preserve"> (05</w:t>
-      </w:r>
-      <w:r>
-        <w:rPr>
-          <w:color w:val="000000" w:themeColor="text1"/>
-          <w:sz w:val="18"/>
-          <w:szCs w:val="18"/>
-        </w:rPr>
-        <w:t xml:space="preserve">/26 a </w:t>
-      </w:r>
-      <w:r>
-        <w:rPr>
-          <w:color w:val="000000" w:themeColor="text1"/>
-          <w:sz w:val="18"/>
-          <w:szCs w:val="18"/>
-        </w:rPr>
-        <w:t>06/</w:t>
-      </w:r>
-      <w:r>
-        <w:rPr>
-          <w:color w:val="000000" w:themeColor="text1"/>
-          <w:sz w:val="18"/>
-          <w:szCs w:val="18"/>
-        </w:rPr>
-        <w:t>2026</w:t>
-      </w:r>
-      <w:r>
-        <w:rPr>
-          <w:color w:val="000000" w:themeColor="text1"/>
-          <w:sz w:val="18"/>
-          <w:szCs w:val="18"/>
-        </w:rPr>
-        <w:t>)</w:t>
-      </w:r>
-      <w:r>
-        <w:rPr>
-          <w:color w:val="000000" w:themeColor="text1"/>
-          <w:sz w:val="18"/>
-          <w:szCs w:val="18"/>
-        </w:rPr>
-        <w:t xml:space="preserve"> </w:t>
+        <w:t xml:space="preserve">Desenvolvimento de Aplicações com IA Generativa e Google Antigravity (SENAI Ary Torres) - 40 h (05/26 a 06/2026) </w:t>
       </w:r>
     </w:p>
     <w:p>
@@ -9674,6 +9614,7 @@
   <w:style w:type="character" w:default="1" w:styleId="Fontepargpadro">
     <w:name w:val="Default Paragraph Font"/>
     <w:uiPriority w:val="1"/>
+    <w:semiHidden/>
     <w:unhideWhenUsed/>
   </w:style>
   <w:style w:type="table" w:default="1" w:styleId="Tabelanormal">

</xml_diff>